<commit_message>
Add UI demonstration to HANS project overview
</commit_message>
<xml_diff>
--- a/deliverables/HANS_Project_Overview_and_Results.docx
+++ b/deliverables/HANS_Project_Overview_and_Results.docx
@@ -4298,6 +4298,63 @@
     </w:p>
     <w:p>
       <w:pPr>
+        <w:keepNext/>
+        <w:jc w:val="center"/>
+      </w:pPr>
+      <w:r>
+        <w:drawing>
+          <wp:inline xmlns:a="http://schemas.openxmlformats.org/drawingml/2006/main" xmlns:pic="http://schemas.openxmlformats.org/drawingml/2006/picture">
+            <wp:extent cx="5303520" cy="3173236"/>
+            <wp:docPr id="3" name="Picture 3"/>
+            <wp:cNvGraphicFramePr>
+              <a:graphicFrameLocks noChangeAspect="1"/>
+            </wp:cNvGraphicFramePr>
+            <a:graphic>
+              <a:graphicData uri="http://schemas.openxmlformats.org/drawingml/2006/picture">
+                <pic:pic>
+                  <pic:nvPicPr>
+                    <pic:cNvPr id="0" name="image(20260926-105350).png"/>
+                    <pic:cNvPicPr/>
+                  </pic:nvPicPr>
+                  <pic:blipFill>
+                    <a:blip r:embed="rId13"/>
+                    <a:stretch>
+                      <a:fillRect/>
+                    </a:stretch>
+                  </pic:blipFill>
+                  <pic:spPr>
+                    <a:xfrm>
+                      <a:off x="0" y="0"/>
+                      <a:ext cx="5303520" cy="3173236"/>
+                    </a:xfrm>
+                    <a:prstGeom prst="rect"/>
+                  </pic:spPr>
+                </pic:pic>
+              </a:graphicData>
+            </a:graphic>
+          </wp:inline>
+        </w:drawing>
+      </w:r>
+    </w:p>
+    <w:p>
+      <w:pPr>
+        <w:jc w:val="center"/>
+      </w:pPr>
+      <w:r>
+        <w:rPr>
+          <w:i/>
+          <w:sz w:val="18"/>
+        </w:rPr>
+        <w:t>Figure 3. Staff-facing HANS UI during a separate manual demonstration on 26 September 2026. Full-size image: docs/diagrams/HANS_UI.png.</w:t>
+      </w:r>
+    </w:p>
+    <w:p>
+      <w:r>
+        <w:t>In this one manual request, the UI reported 3,642 input tokens and 262 output tokens, 3,904 in total, with 57.324 seconds generation time. These values show that token use is visible to staff; they are not the eight-case acceptance average or evidence of an optimized prompt. The draft still needs staff review.</w:t>
+      </w:r>
+    </w:p>
+    <w:p>
+      <w:pPr>
         <w:keepLines w:val="0"/>
       </w:pPr>
       <w:r>

</xml_diff>